<commit_message>
fix: :memo: fix bug
</commit_message>
<xml_diff>
--- a/reports/Repository Use Agreement.docx
+++ b/reports/Repository Use Agreement.docx
@@ -327,6 +327,13 @@
     <w:p/>
     <w:sdt>
       <w:sdtPr>
+        <w:rPr>
+          <w:rFonts w:ascii="Times New Roman" w:eastAsiaTheme="minorHAnsi" w:hAnsi="Times New Roman" w:cstheme="minorBidi"/>
+          <w:color w:val="auto"/>
+          <w:sz w:val="24"/>
+          <w:szCs w:val="22"/>
+          <w:lang w:val="es-ES"/>
+        </w:rPr>
         <w:id w:val="1935943438"/>
         <w:docPartObj>
           <w:docPartGallery w:val="Table of Contents"/>
@@ -335,14 +342,9 @@
       </w:sdtPr>
       <w:sdtEndPr>
         <w:rPr>
-          <w:rFonts w:ascii="Times New Roman" w:eastAsiaTheme="minorHAnsi" w:hAnsi="Times New Roman" w:cstheme="minorBidi"/>
           <w:b/>
           <w:bCs/>
           <w:noProof/>
-          <w:color w:val="auto"/>
-          <w:sz w:val="24"/>
-          <w:szCs w:val="22"/>
-          <w:lang w:val="es-ES"/>
         </w:rPr>
       </w:sdtEndPr>
       <w:sdtContent>
@@ -583,14 +585,18 @@
     <w:p>
       <w:pPr>
         <w:pStyle w:val="Heading2"/>
-      </w:pPr>
-      <w:proofErr w:type="spellStart"/>
-      <w:r>
+        <w:rPr>
+          <w:lang w:val="en-GB"/>
+        </w:rPr>
+      </w:pPr>
+      <w:r>
+        <w:rPr>
+          <w:lang w:val="en-GB"/>
+        </w:rPr>
         <w:lastRenderedPageBreak/>
         <w:t>Permission</w:t>
       </w:r>
       <w:bookmarkEnd w:id="0"/>
-      <w:proofErr w:type="spellEnd"/>
     </w:p>
     <w:p>
       <w:pPr>
@@ -946,14 +952,8 @@
         <w:rPr>
           <w:noProof/>
         </w:rPr>
-        <w:t xml:space="preserve">        </w:t>
-      </w:r>
-      <w:r>
-        <w:rPr>
-          <w:noProof/>
-        </w:rPr>
         <w:drawing>
-          <wp:inline distT="0" distB="0" distL="0" distR="0" wp14:anchorId="3189D877" wp14:editId="10422DF7">
+          <wp:inline distT="0" distB="0" distL="0" distR="0" wp14:anchorId="2A1EF6BE" wp14:editId="00EC997D">
             <wp:extent cx="1642595" cy="950976"/>
             <wp:effectExtent l="0" t="0" r="0" b="1905"/>
             <wp:docPr id="828060418" name="Imagen 1" descr="Un dibujo de una persona&#10;&#10;El contenido generado por IA puede ser incorrecto."/>
@@ -987,6 +987,12 @@
             </a:graphic>
           </wp:inline>
         </w:drawing>
+      </w:r>
+      <w:r>
+        <w:rPr>
+          <w:noProof/>
+        </w:rPr>
+        <w:t xml:space="preserve">     </w:t>
       </w:r>
       <w:r>
         <w:rPr>
@@ -1802,6 +1808,7 @@
   <w:style w:type="character" w:default="1" w:styleId="DefaultParagraphFont">
     <w:name w:val="Default Paragraph Font"/>
     <w:uiPriority w:val="1"/>
+    <w:semiHidden/>
     <w:unhideWhenUsed/>
   </w:style>
   <w:style w:type="table" w:default="1" w:styleId="TableNormal">

</xml_diff>